<commit_message>
docs: establish content governance and synchronized backlog
</commit_message>
<xml_diff>
--- a/docs/product/Cramapple-Vision-v0.2.docx
+++ b/docs/product/Cramapple-Vision-v0.2.docx
@@ -1889,7 +1889,7 @@
         <w:widowControl/>
       </w:pPr>
       <w:r>
-        <w:t>Students, teachers, tutors, and hired subject experts will contribute to validation. Expert sign-off is a launch gate. If the responsible experts do not approve the content and grading behavior, the product does not launch.</w:t>
+        <w:t>Paid tutors and subject experts will create Cramapple's original question packages. Separate qualified reviewers will validate scientific accuracy, teaching quality, exam alignment, and grading behavior. Authors do not approve their own work. Expert sign-off is a launch gate. If the responsible experts do not approve the content and grading behavior, the product does not launch.</w:t>
       </w:r>
     </w:p>
     <w:p>
@@ -1897,6 +1897,46 @@
         <w:widowControl/>
       </w:pPr>
       <w:r>
+        <w:t>The initial bank will include both MCQs and FRQs, with a target of at least ten</w:t>
+      </w:r>
+    </w:p>
+    <w:p>
+      <w:pPr>
+        <w:widowControl/>
+      </w:pPr>
+      <w:r>
+        <w:t>approved questions for each subject-and-subtopic pair. Cramapple may use AI to</w:t>
+      </w:r>
+    </w:p>
+    <w:p>
+      <w:pPr>
+        <w:widowControl/>
+      </w:pPr>
+      <w:r>
+        <w:t>create candidate versions from questions it owns or fully licenses for</w:t>
+      </w:r>
+    </w:p>
+    <w:p>
+      <w:pPr>
+        <w:widowControl/>
+      </w:pPr>
+      <w:r>
+        <w:t>derivative and model use. Each variant is a new artifact and requires a complete</w:t>
+      </w:r>
+    </w:p>
+    <w:p>
+      <w:pPr>
+        <w:widowControl/>
+      </w:pPr>
+      <w:r>
+        <w:t>rubric, teaching package, provenance, and independent validation.</w:t>
+      </w:r>
+    </w:p>
+    <w:p>
+      <w:pPr>
+        <w:widowControl/>
+      </w:pPr>
+      <w:r>
         <w:t>Approval of content alone is insufficient. Before launch, Cramapple should test AI grading against responses independently scored by experts and establish an acceptable level of criterion-by-criterion agreement.</w:t>
       </w:r>
     </w:p>
@@ -1913,7 +1953,15 @@
         <w:widowControl/>
       </w:pPr>
       <w:r>
-        <w:t>Cramapple will align its original content to the publicly available AP Biology course framework, exam structure, and skills. The current working assumption is that official College Board questions and scoring materials will not be placed into a generative AI workflow or reproduced commercially without written permission or legal approval.</w:t>
+        <w:t>Cramapple will align its original content to the publicly available AP Biology course framework, exam structure, and skills. Cramapple will pay qualified tutors and subject experts to independently author original questions and complete rubric packages from approved coverage briefs.</w:t>
+      </w:r>
+    </w:p>
+    <w:p>
+      <w:pPr>
+        <w:widowControl/>
+      </w:pPr>
+      <w:r>
+        <w:t>Official College Board questions and scoring materials will not be used as question seeds, adaptation targets, few-shot examples, or generative-AI inputs, and will not be reproduced commercially without written permission or legal approval. Authorized humans may review public materials for abstract exam alignment where legally permitted, but commissioned work must be independently expressed and supported by approved sources.</w:t>
       </w:r>
     </w:p>
     <w:p>
@@ -3023,7 +3071,7 @@
         <w:widowControl/>
       </w:pPr>
       <w:r>
-        <w:t>Cramapple will use students, teachers, tutors, and paid subject experts to create and validate the product. Detailed workflows must define:</w:t>
+        <w:t>Cramapple will pay qualified tutors and subject experts to create original question packages and will use separate qualified experts to validate them. Detailed workflows must define:</w:t>
       </w:r>
     </w:p>
     <w:p>
@@ -3094,6 +3142,34 @@
       </w:pPr>
       <w:r>
         <w:t>How content is versioned, updated, or retired.</w:t>
+      </w:r>
+    </w:p>
+    <w:p>
+      <w:pPr>
+        <w:pStyle w:val="ListBullet"/>
+        <w:spacing w:after="80" w:line="264" w:lineRule="auto"/>
+        <w:ind w:left="720" w:hanging="360"/>
+      </w:pPr>
+      <w:r>
+        <w:t>How authors are compensated and assign or license commissioned work.</w:t>
+      </w:r>
+    </w:p>
+    <w:p>
+      <w:pPr>
+        <w:pStyle w:val="ListBullet"/>
+        <w:spacing w:after="80" w:line="264" w:lineRule="auto"/>
+        <w:ind w:left="720" w:hanging="360"/>
+      </w:pPr>
+      <w:r>
+        <w:t>How originality, source disclosure, restricted-material exclusion, and</w:t>
+      </w:r>
+    </w:p>
+    <w:p>
+      <w:pPr>
+        <w:widowControl/>
+      </w:pPr>
+      <w:r>
+        <w:t xml:space="preserve">  author-validator independence are enforced.</w:t>
       </w:r>
     </w:p>
     <w:p>

</xml_diff>